<commit_message>
feat(gsm): add tables and chart images to analytical note DOCX
- Template: added Jinja2 chart placeholders ({%p if chart_X %}) for 5 charts
  (activity, night, weekend, top contacts, BTS map)
- note_generator.py: hybrid approach - charts via docxtpl InlineImage,
  tables inserted programmatically via python-docx after rendering
- build_table_data(): generates row data for stats, contacts, anomalies,
  locations tables from gsm_latest.json
- API: /api/gsm/note/generate now accepts "tables" param with selected table names
- Frontend: dialog now has table selection checkboxes (stats, contacts,
  anomalies, locations) alongside chart checkboxes
- Script: update_note_template.py for regenerating template chart tags

Co-Authored-By: Claude Opus 4.6 <noreply@anthropic.com>
</commit_message>
<xml_diff>
--- a/templates/gsm_note_template.docx
+++ b/templates/gsm_note_template.docx
@@ -1182,6 +1182,132 @@
       </w:r>
     </w:p>
     <w:p>
+      <w:r>
+        <w:rPr>
+          <w:color w:val="FFFFFF"/>
+          <w:sz w:val="2"/>
+        </w:rPr>
+        <w:t>{%p if chart_activity %}</w:t>
+      </w:r>
+    </w:p>
+    <w:p>
+      <w:pPr>
+        <w:jc w:val="center"/>
+      </w:pPr>
+      <w:r>
+        <w:rPr>
+          <w:b/>
+          <w:color w:val="000000"/>
+          <w:sz w:val="18"/>
+        </w:rPr>
+        <w:t>Wykres: Rozkład aktywności telekomunikacyjnej</w:t>
+      </w:r>
+    </w:p>
+    <w:p>
+      <w:pPr>
+        <w:jc w:val="center"/>
+      </w:pPr>
+      <w:r>
+        <w:rPr>
+          <w:sz w:val="20"/>
+        </w:rPr>
+        <w:t>{{ chart_activity }}</w:t>
+      </w:r>
+    </w:p>
+    <w:p>
+      <w:r>
+        <w:rPr>
+          <w:color w:val="FFFFFF"/>
+          <w:sz w:val="2"/>
+        </w:rPr>
+        <w:t>{%p endif %}</w:t>
+      </w:r>
+    </w:p>
+    <w:p>
+      <w:r>
+        <w:rPr>
+          <w:color w:val="FFFFFF"/>
+          <w:sz w:val="2"/>
+        </w:rPr>
+        <w:t>{%p if chart_night_activity %}</w:t>
+      </w:r>
+    </w:p>
+    <w:p>
+      <w:pPr>
+        <w:jc w:val="center"/>
+      </w:pPr>
+      <w:r>
+        <w:rPr>
+          <w:b/>
+          <w:color w:val="000000"/>
+          <w:sz w:val="18"/>
+        </w:rPr>
+        <w:t>Wykres: Aktywność nocna</w:t>
+      </w:r>
+    </w:p>
+    <w:p>
+      <w:pPr>
+        <w:jc w:val="center"/>
+      </w:pPr>
+      <w:r>
+        <w:rPr>
+          <w:sz w:val="20"/>
+        </w:rPr>
+        <w:t>{{ chart_night_activity }}</w:t>
+      </w:r>
+    </w:p>
+    <w:p>
+      <w:r>
+        <w:rPr>
+          <w:color w:val="FFFFFF"/>
+          <w:sz w:val="2"/>
+        </w:rPr>
+        <w:t>{%p endif %}</w:t>
+      </w:r>
+    </w:p>
+    <w:p>
+      <w:r>
+        <w:rPr>
+          <w:color w:val="FFFFFF"/>
+          <w:sz w:val="2"/>
+        </w:rPr>
+        <w:t>{%p if chart_weekend_activity %}</w:t>
+      </w:r>
+    </w:p>
+    <w:p>
+      <w:pPr>
+        <w:jc w:val="center"/>
+      </w:pPr>
+      <w:r>
+        <w:rPr>
+          <w:b/>
+          <w:color w:val="000000"/>
+          <w:sz w:val="18"/>
+        </w:rPr>
+        <w:t>Wykres: Aktywność weekendowa</w:t>
+      </w:r>
+    </w:p>
+    <w:p>
+      <w:pPr>
+        <w:jc w:val="center"/>
+      </w:pPr>
+      <w:r>
+        <w:rPr>
+          <w:sz w:val="20"/>
+        </w:rPr>
+        <w:t>{{ chart_weekend_activity }}</w:t>
+      </w:r>
+    </w:p>
+    <w:p>
+      <w:r>
+        <w:rPr>
+          <w:color w:val="FFFFFF"/>
+          <w:sz w:val="2"/>
+        </w:rPr>
+        <w:t>{%p endif %}</w:t>
+      </w:r>
+    </w:p>
+    <w:p>
       <w:pPr>
         <w:pStyle w:val="Heading1"/>
         <w:spacing w:before="120" w:after="80" w:line="240" w:lineRule="auto"/>
@@ -1280,6 +1406,48 @@
           <w:sz w:val="22"/>
         </w:rPr>
         <w:t>.</w:t>
+      </w:r>
+    </w:p>
+    <w:p>
+      <w:r>
+        <w:rPr>
+          <w:color w:val="FFFFFF"/>
+          <w:sz w:val="2"/>
+        </w:rPr>
+        <w:t>{%p if chart_top_contacts %}</w:t>
+      </w:r>
+    </w:p>
+    <w:p>
+      <w:pPr>
+        <w:jc w:val="center"/>
+      </w:pPr>
+      <w:r>
+        <w:rPr>
+          <w:b/>
+          <w:color w:val="000000"/>
+          <w:sz w:val="18"/>
+        </w:rPr>
+        <w:t>Wykres: Najczęstsze kontakty</w:t>
+      </w:r>
+    </w:p>
+    <w:p>
+      <w:pPr>
+        <w:jc w:val="center"/>
+      </w:pPr>
+      <w:r>
+        <w:rPr>
+          <w:sz w:val="20"/>
+        </w:rPr>
+        <w:t>{{ chart_top_contacts }}</w:t>
+      </w:r>
+    </w:p>
+    <w:p>
+      <w:r>
+        <w:rPr>
+          <w:color w:val="FFFFFF"/>
+          <w:sz w:val="2"/>
+        </w:rPr>
+        <w:t>{%p endif %}</w:t>
       </w:r>
     </w:p>
     <w:p>
@@ -1467,6 +1635,48 @@
           <w:sz w:val="22"/>
         </w:rPr>
         <w:t>. W przypadku danych lokalizacyjnych należy pamiętać, że ich interpretacja ma charakter przybliżony i zależy od gęstości sieci oraz sposobu logowania urządzenia do stacji bazowych.</w:t>
+      </w:r>
+    </w:p>
+    <w:p>
+      <w:r>
+        <w:rPr>
+          <w:color w:val="FFFFFF"/>
+          <w:sz w:val="2"/>
+        </w:rPr>
+        <w:t>{%p if chart_map_bts %}</w:t>
+      </w:r>
+    </w:p>
+    <w:p>
+      <w:pPr>
+        <w:jc w:val="center"/>
+      </w:pPr>
+      <w:r>
+        <w:rPr>
+          <w:b/>
+          <w:color w:val="000000"/>
+          <w:sz w:val="18"/>
+        </w:rPr>
+        <w:t>Mapa: Lokalizacje stacji BTS</w:t>
+      </w:r>
+    </w:p>
+    <w:p>
+      <w:pPr>
+        <w:jc w:val="center"/>
+      </w:pPr>
+      <w:r>
+        <w:rPr>
+          <w:sz w:val="20"/>
+        </w:rPr>
+        <w:t>{{ chart_map_bts }}</w:t>
+      </w:r>
+    </w:p>
+    <w:p>
+      <w:r>
+        <w:rPr>
+          <w:color w:val="FFFFFF"/>
+          <w:sz w:val="2"/>
+        </w:rPr>
+        <w:t>{%p endif %}</w:t>
       </w:r>
     </w:p>
     <w:p>

</xml_diff>